<commit_message>
Change od the Statistical module
A bug in FDR correction has been fixed. Now, correction is performed separately for the EEG channels and the supplementary channels (Avg, GFP and Dis). In the EEG, it is corrected according to the number of electrodes for each TF, and in the supplementary channels, it is corrected according to the number of TFs tested.
+
add a check if the minimal cluster size is smaller than the number of Electrode
+
add a check if the duration is smaller than the number of tested TF
+
Preparation of the GUI for the clustering
</commit_message>
<xml_diff>
--- a/Manuels/Manuel_Statistics_module.docx
+++ b/Manuels/Manuel_Statistics_module.docx
@@ -1633,6 +1633,52 @@
         </w:rPr>
         <w:t xml:space="preserve">. </w:t>
       </w:r>
+      <w:r>
+        <w:rPr>
+          <w:rFonts w:ascii="Calibri" w:hAnsi="Calibri" w:cs="Calibri"/>
+          <w:lang w:val="en-US"/>
+        </w:rPr>
+        <w:br/>
+      </w:r>
+      <w:r>
+        <w:rPr>
+          <w:rFonts w:ascii="Calibri" w:hAnsi="Calibri" w:cs="Calibri"/>
+          <w:lang w:val="en-US"/>
+        </w:rPr>
+        <w:t xml:space="preserve">WARNING: Separate corrections are applied to the EEG and supplementary (Avg, GFP and GMD) channels. For example, if you have an EEG with 64 electrodes and activate the GFP option, </w:t>
+      </w:r>
+      <w:proofErr w:type="spellStart"/>
+      <w:r>
+        <w:rPr>
+          <w:rFonts w:ascii="Calibri" w:hAnsi="Calibri" w:cs="Calibri"/>
+          <w:lang w:val="en-US"/>
+        </w:rPr>
+        <w:t>EEGpal</w:t>
+      </w:r>
+      <w:proofErr w:type="spellEnd"/>
+      <w:r>
+        <w:rPr>
+          <w:rFonts w:ascii="Calibri" w:hAnsi="Calibri" w:cs="Calibri"/>
+          <w:lang w:val="en-US"/>
+        </w:rPr>
+        <w:t xml:space="preserve"> will first apply a correction to the EEG channels according to the number of electrodes (i.e. a separate correction for each time frame</w:t>
+      </w:r>
+      <w:proofErr w:type="gramStart"/>
+      <w:r>
+        <w:rPr>
+          <w:rFonts w:ascii="Calibri" w:hAnsi="Calibri" w:cs="Calibri"/>
+          <w:lang w:val="en-US"/>
+        </w:rPr>
+        <w:t>), and</w:t>
+      </w:r>
+      <w:proofErr w:type="gramEnd"/>
+      <w:r>
+        <w:rPr>
+          <w:rFonts w:ascii="Calibri" w:hAnsi="Calibri" w:cs="Calibri"/>
+          <w:lang w:val="en-US"/>
+        </w:rPr>
+        <w:t xml:space="preserve"> then apply a correction to the GFP channels according to the number of time frames.</w:t>
+      </w:r>
     </w:p>
     <w:p>
       <w:pPr>
@@ -2325,12 +2371,78 @@
     <w:p>
       <w:pPr>
         <w:pStyle w:val="ListParagraph"/>
+        <w:rPr>
+          <w:rFonts w:ascii="Calibri" w:hAnsi="Calibri" w:cs="Calibri"/>
+          <w:lang w:val="en-US"/>
+        </w:rPr>
+      </w:pPr>
+      <w:r>
+        <w:rPr>
+          <w:rFonts w:ascii="Calibri" w:hAnsi="Calibri" w:cs="Calibri"/>
+          <w:b/>
+          <w:bCs/>
+          <w:lang w:val="en-US"/>
+        </w:rPr>
+        <w:t>WARNING</w:t>
+      </w:r>
+      <w:r>
+        <w:rPr>
+          <w:rFonts w:ascii="Calibri" w:hAnsi="Calibri" w:cs="Calibri"/>
+          <w:lang w:val="en-US"/>
+        </w:rPr>
+        <w:t xml:space="preserve">: </w:t>
+      </w:r>
+      <w:r>
+        <w:rPr>
+          <w:rFonts w:ascii="Calibri" w:hAnsi="Calibri" w:cs="Calibri"/>
+          <w:lang w:val="en-US"/>
+        </w:rPr>
+        <w:t>If you have selected an FDR correction for multiple comparisons, the p-values in this file are the original values before correction</w:t>
+      </w:r>
+      <w:r>
+        <w:rPr>
+          <w:rFonts w:ascii="Calibri" w:hAnsi="Calibri" w:cs="Calibri"/>
+          <w:lang w:val="en-US"/>
+        </w:rPr>
+        <w:t xml:space="preserve"> </w:t>
+      </w:r>
+      <w:r>
+        <w:rPr>
+          <w:rFonts w:ascii="Calibri" w:hAnsi="Calibri" w:cs="Calibri"/>
+          <w:lang w:val="en-US"/>
+        </w:rPr>
+        <w:t>(and not the q-adjusted values)</w:t>
+      </w:r>
+      <w:r>
+        <w:rPr>
+          <w:rFonts w:ascii="Calibri" w:hAnsi="Calibri" w:cs="Calibri"/>
+          <w:lang w:val="en-US"/>
+        </w:rPr>
+        <w:t>. The correction replaces any p-value with 0 if it does not survive the correction.</w:t>
+      </w:r>
+    </w:p>
+    <w:p>
+      <w:pPr>
+        <w:pStyle w:val="ListParagraph"/>
+        <w:rPr>
+          <w:rFonts w:ascii="Calibri" w:hAnsi="Calibri" w:cs="Calibri"/>
+          <w:b/>
+          <w:bCs/>
+          <w:lang w:val="en-US"/>
+        </w:rPr>
+      </w:pPr>
+    </w:p>
+    <w:p>
+      <w:pPr>
+        <w:pStyle w:val="ListParagraph"/>
         <w:numPr>
           <w:ilvl w:val="0"/>
           <w:numId w:val="3"/>
         </w:numPr>
         <w:rPr>
           <w:rFonts w:ascii="Calibri" w:hAnsi="Calibri" w:cs="Calibri"/>
+          <w:b/>
+          <w:bCs/>
           <w:lang w:val="en-US"/>
         </w:rPr>
       </w:pPr>
@@ -2348,6 +2460,8 @@
       <w:r>
         <w:rPr>
           <w:rFonts w:ascii="Calibri" w:hAnsi="Calibri" w:cs="Calibri"/>
+          <w:i/>
+          <w:iCs/>
           <w:lang w:val="en-US"/>
         </w:rPr>
         <w:t xml:space="preserve"> or </w:t>
@@ -2564,6 +2678,13 @@
           <w:lang w:val="en-US"/>
         </w:rPr>
         <w:br/>
+      </w:r>
+      <w:r>
+        <w:rPr>
+          <w:rFonts w:ascii="Calibri" w:hAnsi="Calibri" w:cs="Calibri"/>
+          <w:lang w:val="en-US"/>
+        </w:rPr>
+        <w:lastRenderedPageBreak/>
         <w:t xml:space="preserve"> </w:t>
       </w:r>
       <w:r>
@@ -2606,6 +2727,22 @@
           </wp:inline>
         </w:drawing>
       </w:r>
+      <w:r>
+        <w:rPr>
+          <w:rFonts w:ascii="Calibri" w:hAnsi="Calibri" w:cs="Calibri"/>
+          <w:lang w:val="en-US"/>
+        </w:rPr>
+        <w:br/>
+      </w:r>
+    </w:p>
+    <w:p>
+      <w:pPr>
+        <w:pStyle w:val="ListParagraph"/>
+        <w:rPr>
+          <w:rFonts w:ascii="Calibri" w:hAnsi="Calibri" w:cs="Calibri"/>
+          <w:lang w:val="en-US"/>
+        </w:rPr>
+      </w:pPr>
     </w:p>
     <w:p>
       <w:pPr>
@@ -2654,7 +2791,6 @@
           <w:bCs/>
           <w:lang w:val="en-US"/>
         </w:rPr>
-        <w:lastRenderedPageBreak/>
         <w:t xml:space="preserve">Which </w:t>
       </w:r>
       <w:proofErr w:type="spellStart"/>
@@ -3290,7 +3426,21 @@
           <w:rFonts w:ascii="Calibri" w:hAnsi="Calibri" w:cs="Calibri"/>
           <w:lang w:val="en-US"/>
         </w:rPr>
-        <w:t xml:space="preserve">It is important to note that the correction is made over the number of channels and not the number of TF. Indeed, the correction is computed separately for each TF. This is the strategy used in </w:t>
+        <w:t>It is important to note that the correction is made over the number of channels and not the number of TF</w:t>
+      </w:r>
+      <w:r>
+        <w:rPr>
+          <w:rFonts w:ascii="Calibri" w:hAnsi="Calibri" w:cs="Calibri"/>
+          <w:lang w:val="en-US"/>
+        </w:rPr>
+        <w:t xml:space="preserve"> for the EEG</w:t>
+      </w:r>
+      <w:r>
+        <w:rPr>
+          <w:rFonts w:ascii="Calibri" w:hAnsi="Calibri" w:cs="Calibri"/>
+          <w:lang w:val="en-US"/>
+        </w:rPr>
+        <w:t xml:space="preserve">. Indeed, the correction is computed separately for each TF. This is the strategy used in </w:t>
       </w:r>
       <w:proofErr w:type="spellStart"/>
       <w:r>
@@ -3338,7 +3488,15 @@
           <w:rFonts w:ascii="Calibri" w:hAnsi="Calibri" w:cs="Calibri"/>
           <w:lang w:val="en-US"/>
         </w:rPr>
-        <w:t xml:space="preserve"> of TF) is too conservative. In addition, the results between TF are not independent between them (value for the numbers TF is strongly correlated with current TF). It is why we decided to apply the correction separately </w:t>
+        <w:t xml:space="preserve"> of TF) is too conservative. In addition, the results between TF are not independent between them (value for the </w:t>
+      </w:r>
+      <w:r>
+        <w:rPr>
+          <w:rFonts w:ascii="Calibri" w:hAnsi="Calibri" w:cs="Calibri"/>
+          <w:lang w:val="en-US"/>
+        </w:rPr>
+        <w:lastRenderedPageBreak/>
+        <w:t xml:space="preserve">numbers TF is strongly correlated with current TF). It is why we decided to apply the correction separately </w:t>
       </w:r>
       <w:proofErr w:type="gramStart"/>
       <w:r>
@@ -3355,6 +3513,20 @@
           <w:lang w:val="en-US"/>
         </w:rPr>
         <w:t xml:space="preserve"> TF. </w:t>
+      </w:r>
+      <w:r>
+        <w:rPr>
+          <w:rFonts w:ascii="Calibri" w:hAnsi="Calibri" w:cs="Calibri"/>
+          <w:lang w:val="en-US"/>
+        </w:rPr>
+        <w:br/>
+      </w:r>
+      <w:r>
+        <w:rPr>
+          <w:rFonts w:ascii="Calibri" w:hAnsi="Calibri" w:cs="Calibri"/>
+          <w:lang w:val="en-US"/>
+        </w:rPr>
+        <w:t xml:space="preserve">In the case of the additional computed channels (Avg, GFP and GMD), the correction is applied separately to each of them according to the number of time frames.  </w:t>
       </w:r>
     </w:p>
     <w:p>

</xml_diff>

<commit_message>
Update Statistics module finished
Update of the Statistics module is now finished. It includes:
- non-parametric stat with filedtrip
- option to save 1-p or p
</commit_message>
<xml_diff>
--- a/Manuels/Manuel_Statistics_module.docx
+++ b/Manuels/Manuel_Statistics_module.docx
@@ -73,14 +73,14 @@
           <w:rFonts w:ascii="Calibri" w:hAnsi="Calibri" w:cs="Calibri"/>
           <w:lang w:val="en-US"/>
         </w:rPr>
-        <w:t>.0</w:t>
-      </w:r>
-      <w:r>
-        <w:rPr>
-          <w:rFonts w:ascii="Calibri" w:hAnsi="Calibri" w:cs="Calibri"/>
-          <w:lang w:val="en-US"/>
-        </w:rPr>
-        <w:t>1</w:t>
+        <w:t>.</w:t>
+      </w:r>
+      <w:r>
+        <w:rPr>
+          <w:rFonts w:ascii="Calibri" w:hAnsi="Calibri" w:cs="Calibri"/>
+          <w:lang w:val="en-US"/>
+        </w:rPr>
+        <w:t>16</w:t>
       </w:r>
       <w:r>
         <w:rPr>
@@ -94,7 +94,7 @@
           <w:rFonts w:ascii="Calibri" w:hAnsi="Calibri" w:cs="Calibri"/>
           <w:lang w:val="en-US"/>
         </w:rPr>
-        <w:t>20</w:t>
+        <w:t>13</w:t>
       </w:r>
       <w:r>
         <w:rPr>
@@ -108,7 +108,7 @@
           <w:rFonts w:ascii="Calibri" w:hAnsi="Calibri" w:cs="Calibri"/>
           <w:lang w:val="en-US"/>
         </w:rPr>
-        <w:t>11</w:t>
+        <w:t>09</w:t>
       </w:r>
       <w:r>
         <w:rPr>
@@ -122,7 +122,7 @@
           <w:rFonts w:ascii="Calibri" w:hAnsi="Calibri" w:cs="Calibri"/>
           <w:lang w:val="en-US"/>
         </w:rPr>
-        <w:t>5</w:t>
+        <w:t>6</w:t>
       </w:r>
     </w:p>
     <w:p>
@@ -361,14 +361,21 @@
           <w:rFonts w:ascii="Calibri" w:hAnsi="Calibri" w:cs="Calibri"/>
           <w:lang w:val="en-US"/>
         </w:rPr>
-        <w:t>T</w:t>
-      </w:r>
-      <w:r>
-        <w:rPr>
-          <w:rFonts w:ascii="Calibri" w:hAnsi="Calibri" w:cs="Calibri"/>
-          <w:lang w:val="en-US"/>
-        </w:rPr>
-        <w:t xml:space="preserve">he </w:t>
+        <w:t xml:space="preserve">The parametric and ANOVA test </w:t>
+      </w:r>
+      <w:r>
+        <w:rPr>
+          <w:rFonts w:ascii="Calibri" w:hAnsi="Calibri" w:cs="Calibri"/>
+          <w:lang w:val="en-US"/>
+        </w:rPr>
+        <w:t xml:space="preserve">required </w:t>
+      </w:r>
+      <w:r>
+        <w:rPr>
+          <w:rFonts w:ascii="Calibri" w:hAnsi="Calibri" w:cs="Calibri"/>
+          <w:lang w:val="en-US"/>
+        </w:rPr>
+        <w:t xml:space="preserve">the MATLAB </w:t>
       </w:r>
       <w:r>
         <w:rPr>
@@ -377,36 +384,6 @@
           <w:bCs/>
           <w:lang w:val="en-US"/>
         </w:rPr>
-        <w:t>Statistics</w:t>
-      </w:r>
-      <w:r>
-        <w:rPr>
-          <w:rFonts w:ascii="Calibri" w:hAnsi="Calibri" w:cs="Calibri"/>
-          <w:lang w:val="en-US"/>
-        </w:rPr>
-        <w:t xml:space="preserve"> module </w:t>
-      </w:r>
-      <w:r>
-        <w:rPr>
-          <w:rFonts w:ascii="Calibri" w:hAnsi="Calibri" w:cs="Calibri"/>
-          <w:lang w:val="en-US"/>
-        </w:rPr>
-        <w:t xml:space="preserve">required </w:t>
-      </w:r>
-      <w:r>
-        <w:rPr>
-          <w:rFonts w:ascii="Calibri" w:hAnsi="Calibri" w:cs="Calibri"/>
-          <w:lang w:val="en-US"/>
-        </w:rPr>
-        <w:t xml:space="preserve">the MATLAB </w:t>
-      </w:r>
-      <w:r>
-        <w:rPr>
-          <w:rFonts w:ascii="Calibri" w:hAnsi="Calibri" w:cs="Calibri"/>
-          <w:b/>
-          <w:bCs/>
-          <w:lang w:val="en-US"/>
-        </w:rPr>
         <w:t>Statistics and Machine Learning Toolbox</w:t>
       </w:r>
       <w:r>
@@ -422,6 +399,29 @@
           <w:lang w:val="en-US"/>
         </w:rPr>
         <w:t xml:space="preserve"> to work.</w:t>
+      </w:r>
+      <w:r>
+        <w:rPr>
+          <w:rFonts w:ascii="Calibri" w:hAnsi="Calibri" w:cs="Calibri"/>
+          <w:lang w:val="en-US"/>
+        </w:rPr>
+        <w:t xml:space="preserve"> It is not required for the non-parametric paired or unpaired T-test because it </w:t>
+      </w:r>
+      <w:proofErr w:type="gramStart"/>
+      <w:r>
+        <w:rPr>
+          <w:rFonts w:ascii="Calibri" w:hAnsi="Calibri" w:cs="Calibri"/>
+          <w:lang w:val="en-US"/>
+        </w:rPr>
+        <w:t>use</w:t>
+      </w:r>
+      <w:proofErr w:type="gramEnd"/>
+      <w:r>
+        <w:rPr>
+          <w:rFonts w:ascii="Calibri" w:hAnsi="Calibri" w:cs="Calibri"/>
+          <w:lang w:val="en-US"/>
+        </w:rPr>
+        <w:t xml:space="preserve"> Fieldtrip functions.</w:t>
       </w:r>
     </w:p>
     <w:p>
@@ -751,7 +751,6 @@
           <w:rFonts w:ascii="Calibri" w:hAnsi="Calibri" w:cs="Calibri"/>
           <w:lang w:val="en-US"/>
         </w:rPr>
-        <w:lastRenderedPageBreak/>
         <w:t>Statistics</w:t>
       </w:r>
     </w:p>
@@ -766,14 +765,13 @@
       <w:r>
         <w:rPr>
           <w:rFonts w:ascii="Calibri" w:hAnsi="Calibri" w:cs="Calibri"/>
-          <w:noProof/>
           <w:lang w:val="en-US"/>
         </w:rPr>
         <w:drawing>
-          <wp:inline distT="0" distB="0" distL="0" distR="0" wp14:anchorId="4E0A12B6" wp14:editId="18323D7A">
-            <wp:extent cx="5760720" cy="2806065"/>
+          <wp:inline distT="0" distB="0" distL="0" distR="0" wp14:anchorId="5324EBE5" wp14:editId="30681751">
+            <wp:extent cx="5760720" cy="4457700"/>
             <wp:effectExtent l="0" t="0" r="0" b="0"/>
-            <wp:docPr id="184227185" name="Picture 1" descr="A screenshot of a computer&#10;&#10;AI-generated content may be incorrect."/>
+            <wp:docPr id="1250512486" name="Picture 1"/>
             <wp:cNvGraphicFramePr>
               <a:graphicFrameLocks xmlns:a="http://schemas.openxmlformats.org/drawingml/2006/main" noChangeAspect="1"/>
             </wp:cNvGraphicFramePr>
@@ -781,7 +779,7 @@
               <a:graphicData uri="http://schemas.openxmlformats.org/drawingml/2006/picture">
                 <pic:pic xmlns:pic="http://schemas.openxmlformats.org/drawingml/2006/picture">
                   <pic:nvPicPr>
-                    <pic:cNvPr id="184227185" name="Picture 1" descr="A screenshot of a computer&#10;&#10;AI-generated content may be incorrect."/>
+                    <pic:cNvPr id="1250512486" name=""/>
                     <pic:cNvPicPr/>
                   </pic:nvPicPr>
                   <pic:blipFill>
@@ -793,7 +791,7 @@
                   <pic:spPr>
                     <a:xfrm>
                       <a:off x="0" y="0"/>
-                      <a:ext cx="5760720" cy="2806065"/>
+                      <a:ext cx="5760720" cy="4457700"/>
                     </a:xfrm>
                     <a:prstGeom prst="rect">
                       <a:avLst/>
@@ -808,6 +806,25 @@
     </w:p>
     <w:p>
       <w:pPr>
+        <w:rPr>
+          <w:rFonts w:ascii="Calibri" w:hAnsi="Calibri" w:cs="Calibri"/>
+          <w:b/>
+          <w:bCs/>
+          <w:lang w:val="en-US"/>
+        </w:rPr>
+      </w:pPr>
+      <w:r>
+        <w:rPr>
+          <w:rFonts w:ascii="Calibri" w:hAnsi="Calibri" w:cs="Calibri"/>
+          <w:b/>
+          <w:bCs/>
+          <w:lang w:val="en-US"/>
+        </w:rPr>
+        <w:t xml:space="preserve">Pannel A: </w:t>
+      </w:r>
+    </w:p>
+    <w:p>
+      <w:pPr>
         <w:pStyle w:val="ListParagraph"/>
         <w:numPr>
           <w:ilvl w:val="0"/>
@@ -1296,6 +1313,7 @@
           <w:rFonts w:ascii="Calibri" w:hAnsi="Calibri" w:cs="Calibri"/>
           <w:lang w:val="en-US"/>
         </w:rPr>
+        <w:lastRenderedPageBreak/>
         <w:t xml:space="preserve"> </w:t>
       </w:r>
       <w:r>
@@ -1614,7 +1632,6 @@
           <w:rFonts w:ascii="Calibri" w:hAnsi="Calibri" w:cs="Calibri"/>
           <w:lang w:val="en-US"/>
         </w:rPr>
-        <w:lastRenderedPageBreak/>
         <w:t xml:space="preserve">You can specify the False Discovery rate (q) you want to apply. Usually, the value of 0.05 is quite standard. See the FAQ for more </w:t>
       </w:r>
       <w:proofErr w:type="gramStart"/>
@@ -2236,12 +2253,157 @@
         </w:rPr>
         <w:t xml:space="preserve">. </w:t>
       </w:r>
-      <w:r>
-        <w:rPr>
-          <w:rFonts w:ascii="Calibri" w:hAnsi="Calibri" w:cs="Calibri"/>
-          <w:lang w:val="en-US"/>
-        </w:rPr>
-        <w:t xml:space="preserve">In fact, these values are 1-p because the significant values lie within the 0.95–1 interval (rather than the usual 0–0.05 interval). All zero values indicate that the test was not significant according to the specified criteria. You can use the </w:t>
+      <w:proofErr w:type="spellStart"/>
+      <w:r>
+        <w:rPr>
+          <w:rFonts w:ascii="Calibri" w:hAnsi="Calibri" w:cs="Calibri"/>
+          <w:lang w:val="en-US"/>
+        </w:rPr>
+        <w:t>Acoording</w:t>
+      </w:r>
+      <w:proofErr w:type="spellEnd"/>
+      <w:r>
+        <w:rPr>
+          <w:rFonts w:ascii="Calibri" w:hAnsi="Calibri" w:cs="Calibri"/>
+          <w:lang w:val="en-US"/>
+        </w:rPr>
+        <w:t xml:space="preserve"> the option you have choose in </w:t>
+      </w:r>
+      <w:r>
+        <w:rPr>
+          <w:rFonts w:ascii="Calibri" w:hAnsi="Calibri" w:cs="Calibri"/>
+          <w:b/>
+          <w:bCs/>
+          <w:lang w:val="en-US"/>
+        </w:rPr>
+        <w:t>X</w:t>
+      </w:r>
+      <w:r>
+        <w:rPr>
+          <w:rFonts w:ascii="Calibri" w:hAnsi="Calibri" w:cs="Calibri"/>
+          <w:lang w:val="en-US"/>
+        </w:rPr>
+        <w:t xml:space="preserve">, value </w:t>
+      </w:r>
+      <w:proofErr w:type="gramStart"/>
+      <w:r>
+        <w:rPr>
+          <w:rFonts w:ascii="Calibri" w:hAnsi="Calibri" w:cs="Calibri"/>
+          <w:lang w:val="en-US"/>
+        </w:rPr>
+        <w:t>are</w:t>
+      </w:r>
+      <w:proofErr w:type="gramEnd"/>
+      <w:r>
+        <w:rPr>
+          <w:rFonts w:ascii="Calibri" w:hAnsi="Calibri" w:cs="Calibri"/>
+          <w:lang w:val="en-US"/>
+        </w:rPr>
+        <w:t xml:space="preserve"> 1-p (</w:t>
+      </w:r>
+      <w:r>
+        <w:rPr>
+          <w:rFonts w:ascii="Calibri" w:hAnsi="Calibri" w:cs="Calibri"/>
+          <w:lang w:val="en-US"/>
+        </w:rPr>
+        <w:t>significant values lie within the 0.95–1 interval</w:t>
+      </w:r>
+      <w:r>
+        <w:rPr>
+          <w:rFonts w:ascii="Calibri" w:hAnsi="Calibri" w:cs="Calibri"/>
+          <w:lang w:val="en-US"/>
+        </w:rPr>
+        <w:t>) or p (</w:t>
+      </w:r>
+      <w:r>
+        <w:rPr>
+          <w:rFonts w:ascii="Calibri" w:hAnsi="Calibri" w:cs="Calibri"/>
+          <w:lang w:val="en-US"/>
+        </w:rPr>
+        <w:t>rather than the usual 0–0.05 interval</w:t>
+      </w:r>
+      <w:r>
+        <w:rPr>
+          <w:rFonts w:ascii="Calibri" w:hAnsi="Calibri" w:cs="Calibri"/>
+          <w:lang w:val="en-US"/>
+        </w:rPr>
+        <w:t xml:space="preserve">). </w:t>
+      </w:r>
+      <w:proofErr w:type="gramStart"/>
+      <w:r>
+        <w:rPr>
+          <w:rFonts w:ascii="Calibri" w:hAnsi="Calibri" w:cs="Calibri"/>
+          <w:lang w:val="en-US"/>
+        </w:rPr>
+        <w:t>The option</w:t>
+      </w:r>
+      <w:proofErr w:type="gramEnd"/>
+      <w:r>
+        <w:rPr>
+          <w:rFonts w:ascii="Calibri" w:hAnsi="Calibri" w:cs="Calibri"/>
+          <w:lang w:val="en-US"/>
+        </w:rPr>
+        <w:t xml:space="preserve"> 1-p is the default because it makes the visualization of the results easier in </w:t>
+      </w:r>
+      <w:proofErr w:type="spellStart"/>
+      <w:r>
+        <w:rPr>
+          <w:rFonts w:ascii="Calibri" w:hAnsi="Calibri" w:cs="Calibri"/>
+          <w:lang w:val="en-US"/>
+        </w:rPr>
+        <w:t>Cartool</w:t>
+      </w:r>
+      <w:proofErr w:type="spellEnd"/>
+      <w:r>
+        <w:rPr>
+          <w:rFonts w:ascii="Calibri" w:hAnsi="Calibri" w:cs="Calibri"/>
+          <w:lang w:val="en-US"/>
+        </w:rPr>
+        <w:t xml:space="preserve">. However, you can change (for example if you </w:t>
+      </w:r>
+      <w:proofErr w:type="gramStart"/>
+      <w:r>
+        <w:rPr>
+          <w:rFonts w:ascii="Calibri" w:hAnsi="Calibri" w:cs="Calibri"/>
+          <w:lang w:val="en-US"/>
+        </w:rPr>
+        <w:t>export</w:t>
+      </w:r>
+      <w:proofErr w:type="gramEnd"/>
+      <w:r>
+        <w:rPr>
+          <w:rFonts w:ascii="Calibri" w:hAnsi="Calibri" w:cs="Calibri"/>
+          <w:lang w:val="en-US"/>
+        </w:rPr>
+        <w:t xml:space="preserve"> in the .csv file). </w:t>
+      </w:r>
+      <w:r>
+        <w:rPr>
+          <w:rFonts w:ascii="Calibri" w:hAnsi="Calibri" w:cs="Calibri"/>
+          <w:lang w:val="en-US"/>
+        </w:rPr>
+        <w:br/>
+      </w:r>
+      <w:r>
+        <w:rPr>
+          <w:rFonts w:ascii="Calibri" w:hAnsi="Calibri" w:cs="Calibri"/>
+          <w:lang w:val="en-US"/>
+        </w:rPr>
+        <w:t xml:space="preserve">All zero values indicate that the test was not significant according to the specified criteria. </w:t>
+      </w:r>
+      <w:r>
+        <w:rPr>
+          <w:rFonts w:ascii="Calibri" w:hAnsi="Calibri" w:cs="Calibri"/>
+          <w:lang w:val="en-US"/>
+        </w:rPr>
+        <w:br/>
+      </w:r>
+      <w:r>
+        <w:rPr>
+          <w:rFonts w:ascii="Calibri" w:hAnsi="Calibri" w:cs="Calibri"/>
+          <w:lang w:val="en-US"/>
+        </w:rPr>
+        <w:t xml:space="preserve">You can use the </w:t>
       </w:r>
       <w:proofErr w:type="spellStart"/>
       <w:r>
@@ -2351,6 +2513,22 @@
           <w:szCs w:val="18"/>
           <w:lang w:val="en-US"/>
         </w:rPr>
+        <w:t>1-p figure</w:t>
+      </w:r>
+      <w:r>
+        <w:rPr>
+          <w:rFonts w:ascii="Calibri" w:hAnsi="Calibri" w:cs="Calibri"/>
+          <w:lang w:val="en-US"/>
+        </w:rPr>
+        <w:t xml:space="preserve"> </w:t>
+      </w:r>
+      <w:r>
+        <w:rPr>
+          <w:rFonts w:ascii="Calibri" w:hAnsi="Calibri" w:cs="Calibri"/>
+          <w:sz w:val="18"/>
+          <w:szCs w:val="18"/>
+          <w:lang w:val="en-US"/>
+        </w:rPr>
         <w:t>Yellow and red are the significant results and grey are the non-significant results.</w:t>
       </w:r>
       <w:r>
@@ -2358,14 +2536,7 @@
           <w:rFonts w:ascii="Calibri" w:hAnsi="Calibri" w:cs="Calibri"/>
           <w:lang w:val="en-US"/>
         </w:rPr>
-        <w:t xml:space="preserve"> </w:t>
-      </w:r>
-      <w:r>
-        <w:rPr>
-          <w:rFonts w:ascii="Calibri" w:hAnsi="Calibri" w:cs="Calibri"/>
-          <w:lang w:val="en-US"/>
-        </w:rPr>
-        <w:t xml:space="preserve"> </w:t>
+        <w:t xml:space="preserve">  </w:t>
       </w:r>
     </w:p>
     <w:p>

</xml_diff>